<commit_message>
style(templates): unify Disclosure Statement font to Arial
The Amortization Schedule table was set in Courier New (monospace)
while the rest of the document used Segoe UI - correct rendering
once the Docker font fix landed made the mismatch visible for the
first time. Changed the whole document to Arial for consistency.

Co-Authored-By: Claude Sonnet 5 <noreply@anthropic.com>
</commit_message>
<xml_diff>
--- a/app/backend/templates/DATA_PRIVACY_CONSENT.docx
+++ b/app/backend/templates/DATA_PRIVACY_CONSENT.docx
@@ -162,7 +162,39 @@
           <w:sz w:val="15"/>
           <w:szCs w:val="15"/>
         </w:rPr>
-        <w:t>I/We are fully informed through this Data Privacy Statement and Consent of Easycash’s guidelines regarding the processing of my/our personal data, which Easycash received by means of my/our loan, credit, or financial accommodation application submitted through Easycash’s office, website, or mobile application. I/We understand that all information that I/We declared and indicated for the purpose of obtaining loan, credit or any other financial accommodation may be used for verification, credit and risk management, credit scoring, know your customer checks, prevention and detection of fraud or crime, data analytics, automated and or manual processing of the loan, credit or financial accommodation application/s, data profiling, account review, upselling and cross-selling, direct marketing, complaints management, insurance, audit and administrative purposes, relationship management, system or product development and planning among other purposes and will be strictly kept confidential.</w:t>
+        <w:t xml:space="preserve">I/We are fully informed through this Data Privacy Statement and Consent of </w:t>
+      </w:r>
+      <w:proofErr w:type="spellStart"/>
+      <w:r>
+        <w:rPr>
+          <w:sz w:val="15"/>
+          <w:szCs w:val="15"/>
+        </w:rPr>
+        <w:t>Easycash’s</w:t>
+      </w:r>
+      <w:proofErr w:type="spellEnd"/>
+      <w:r>
+        <w:rPr>
+          <w:sz w:val="15"/>
+          <w:szCs w:val="15"/>
+        </w:rPr>
+        <w:t xml:space="preserve"> guidelines regarding the processing of my/our personal data, which Easycash received by means of my/our loan, credit, or financial accommodation application submitted through </w:t>
+      </w:r>
+      <w:proofErr w:type="spellStart"/>
+      <w:r>
+        <w:rPr>
+          <w:sz w:val="15"/>
+          <w:szCs w:val="15"/>
+        </w:rPr>
+        <w:t>Easycash’s</w:t>
+      </w:r>
+      <w:proofErr w:type="spellEnd"/>
+      <w:r>
+        <w:rPr>
+          <w:sz w:val="15"/>
+          <w:szCs w:val="15"/>
+        </w:rPr>
+        <w:t xml:space="preserve"> office, website, or mobile application. I/We understand that all information that I/We declared and indicated for the purpose of obtaining loan, credit or any other financial accommodation may be used for verification, credit and risk management, credit scoring, know your customer checks, prevention and detection of fraud or crime, data analytics, automated and or manual processing of the loan, credit or financial accommodation application/s, data profiling, account review, upselling and cross-selling, direct marketing, complaints management, insurance, audit and administrative purposes, relationship management, system or product development and planning among other purposes and will be strictly kept confidential.</w:t>
       </w:r>
     </w:p>
     <w:p>
@@ -234,142 +266,281 @@
           <w:sz w:val="15"/>
           <w:szCs w:val="15"/>
         </w:rPr>
-        <w:t>2. I/We understand that Easycash works with partners, credit bureau entities, and third-party service providers to effectively serve its clients, including me/us. I/We are informed that Easycash’s partners, credit bureau entities,s and third-party service providers may include my/our employer, whether private or government (for payroll deduction or any other auto-deduction procedures), relevant government agencies, credit bureaus, banks and financial institutions, collection agencies, and other entities.</w:t>
-      </w:r>
-    </w:p>
-    <w:p>
-      <w:pPr>
-        <w:spacing w:line="240" w:lineRule="auto"/>
-        <w:jc w:val="both"/>
-        <w:rPr>
-          <w:sz w:val="15"/>
-          <w:szCs w:val="15"/>
-        </w:rPr>
-      </w:pPr>
-    </w:p>
-    <w:p>
-      <w:pPr>
-        <w:spacing w:line="240" w:lineRule="auto"/>
-        <w:jc w:val="both"/>
-        <w:rPr>
-          <w:sz w:val="15"/>
-          <w:szCs w:val="15"/>
-        </w:rPr>
-      </w:pPr>
-      <w:r>
-        <w:rPr>
-          <w:sz w:val="15"/>
-          <w:szCs w:val="15"/>
-        </w:rPr>
-        <w:t>3. I/We authorize Easycash, directly or through its partners, credit bureau entities and third party service providers, to collect, process, use, store, disclose and share my/our personal data including but not limited to my/our name/s, age/s, birthdate/s, birthplace/s or ethnic origin/s, religion, civil status/es, spouse’s details, educational background/s, family background/s, preferences, behaviour, photographs, fingerprints, other biometric data (facial recognition and voice recognition), employment and or business details, income, financial data, and other information that I/We indicated in the application form. I/We allow the use of these information for verification, credit and risk management, credit scoring, know your customer checks, prevention and detection of fraud or crime, data analytics, automated and or manual processing of the loan, credit or financial accommodation application/s, data profiling, account review, upselling and cross-selling, direct marketing, complaints management, insurance, audit and administrative purposes, relationship management, system or product development and planning among other purposes as well as collecting and establishing applicable interest and amount.</w:t>
-      </w:r>
-    </w:p>
-    <w:p>
-      <w:pPr>
-        <w:spacing w:line="240" w:lineRule="auto"/>
-        <w:jc w:val="both"/>
-        <w:rPr>
-          <w:sz w:val="15"/>
-          <w:szCs w:val="15"/>
-        </w:rPr>
-      </w:pPr>
-    </w:p>
-    <w:p>
-      <w:pPr>
-        <w:spacing w:line="240" w:lineRule="auto"/>
-        <w:jc w:val="both"/>
-        <w:rPr>
-          <w:sz w:val="15"/>
-          <w:szCs w:val="15"/>
-        </w:rPr>
-      </w:pPr>
-      <w:r>
-        <w:rPr>
-          <w:sz w:val="15"/>
-          <w:szCs w:val="15"/>
-        </w:rPr>
-        <w:t>4. I/We allow Easycash to share my/our personal data with Easycash‘s subsidiaries, partners, credit bureau entities, and third-party service providers. I/We understand that these personal data will be utilized for verification, credit and risk management, credit scoring, know your customer checks, prevention and detection of fraud or crime, data analytics, automated and or manual processing of the loan, credit or financial accommodation application/s, data profiling, account review, upselling and cross-selling, direct marketing, complaints management, insurance, audit and administrative purposes, relationship management, system or product development and planning among other purposes as well as collecting and establishing applicable interest and amount.</w:t>
-      </w:r>
-    </w:p>
-    <w:p>
-      <w:pPr>
-        <w:spacing w:line="240" w:lineRule="auto"/>
-        <w:jc w:val="both"/>
-        <w:rPr>
-          <w:sz w:val="15"/>
-          <w:szCs w:val="15"/>
-        </w:rPr>
-      </w:pPr>
-    </w:p>
-    <w:p>
-      <w:pPr>
-        <w:spacing w:line="240" w:lineRule="auto"/>
-        <w:jc w:val="both"/>
-        <w:rPr>
-          <w:sz w:val="15"/>
-          <w:szCs w:val="15"/>
-        </w:rPr>
-      </w:pPr>
-      <w:r>
-        <w:rPr>
-          <w:sz w:val="15"/>
-          <w:szCs w:val="15"/>
-        </w:rPr>
-        <w:t>5. I/We authorize Easycash’s subsidiaries, partners, credit bureau entities and third party service providers to share with Easycash, its affiliates or subsidiaries, my/our personal data for authentication and verification, credit and risk management, credit scoring, know your customer checks, prevention and detection of fraud or crime, data analytics, automated and or manual processing of the loan, credit or financial accommodation application/s, data profiling, review, upselling and cross-selling, direct marketing, complaints management, insurance, audit and administrative purposes, relationship management, system or product development and planning among other purposes as well as collecting and establishing applicable interest and amount.</w:t>
-      </w:r>
-    </w:p>
-    <w:p>
-      <w:pPr>
-        <w:spacing w:line="240" w:lineRule="auto"/>
-        <w:jc w:val="both"/>
-        <w:rPr>
-          <w:sz w:val="15"/>
-          <w:szCs w:val="15"/>
-        </w:rPr>
-      </w:pPr>
-    </w:p>
-    <w:p>
-      <w:pPr>
-        <w:spacing w:line="240" w:lineRule="auto"/>
-        <w:jc w:val="both"/>
-        <w:rPr>
-          <w:sz w:val="15"/>
-          <w:szCs w:val="15"/>
-        </w:rPr>
-      </w:pPr>
-      <w:r>
-        <w:rPr>
-          <w:sz w:val="15"/>
-          <w:szCs w:val="15"/>
-        </w:rPr>
-        <w:t>6. I/We give consent to Easycash and its subsidiaries, partners, credit bureau entities and third party service providers for them to contact me/us by means of personal visit, phone call and or send me/us messages, notices, announcements through pre-recorded voice and or video messages, fax, MMS/SMS, email, postal mail, or any other means of communication for: (a) updating me/us about the status of my/our loan, credit and or financial accommodation application and or account; (b) collection purpose; (c) marketing and or cross selling or upselling of Easycash’s other products and services; and (d) for any other legal purpose. I/We also authorize Easycash and affiliates, subsidiaries, partners, credit bureau entities, and third-party service providers to record the telephone conversations or any conversation with its employees, representatives, or agents. Furthermore, I/We agree to hold Easycash not liable to any loss, injury, or damage that I/We may suffer in relation to any means of communication specified above from Easycash.</w:t>
-      </w:r>
-    </w:p>
-    <w:p>
-      <w:pPr>
-        <w:spacing w:line="240" w:lineRule="auto"/>
-        <w:jc w:val="both"/>
-        <w:rPr>
-          <w:sz w:val="15"/>
-          <w:szCs w:val="15"/>
-        </w:rPr>
-      </w:pPr>
-    </w:p>
-    <w:p>
-      <w:pPr>
-        <w:spacing w:line="240" w:lineRule="auto"/>
-        <w:jc w:val="both"/>
-        <w:rPr>
-          <w:sz w:val="15"/>
-          <w:szCs w:val="15"/>
-        </w:rPr>
-      </w:pPr>
-      <w:r>
-        <w:rPr>
-          <w:sz w:val="15"/>
-          <w:szCs w:val="15"/>
-        </w:rPr>
-        <w:t>7. I/We authorize Easycash to maintain copy/ies of my/our personal data, pertinent information, and other documents for up to five (5) years for Easycash to perform its sanctioned objectives and purposes effectively, legal claims, or any other purpose as provided by law. I/We are also informed that all of my/our personal data may continue to be collected, stored, processed and or shared for up to five (5) years from the conclusion of my/our transactions with Easycash, its subsidiaries, partners, credit bureau entities and third party service providers or until the expiration of the retention limits set by applicable laws, whichever comes later.</w:t>
+        <w:t xml:space="preserve">2. I/We understand that Easycash works with partners, credit bureau entities, and third-party service providers to effectively serve its clients, including me/us. I/We are informed that </w:t>
+      </w:r>
+      <w:proofErr w:type="spellStart"/>
+      <w:r>
+        <w:rPr>
+          <w:sz w:val="15"/>
+          <w:szCs w:val="15"/>
+        </w:rPr>
+        <w:t>Easycash’s</w:t>
+      </w:r>
+      <w:proofErr w:type="spellEnd"/>
+      <w:r>
+        <w:rPr>
+          <w:sz w:val="15"/>
+          <w:szCs w:val="15"/>
+        </w:rPr>
+        <w:t xml:space="preserve"> partners, credit bureau </w:t>
+      </w:r>
+      <w:proofErr w:type="spellStart"/>
+      <w:proofErr w:type="gramStart"/>
+      <w:r>
+        <w:rPr>
+          <w:sz w:val="15"/>
+          <w:szCs w:val="15"/>
+        </w:rPr>
+        <w:t>entities,s</w:t>
+      </w:r>
+      <w:proofErr w:type="spellEnd"/>
+      <w:proofErr w:type="gramEnd"/>
+      <w:r>
+        <w:rPr>
+          <w:sz w:val="15"/>
+          <w:szCs w:val="15"/>
+        </w:rPr>
+        <w:t xml:space="preserve"> and third-party service providers may include my/our employer, whether private or government (for payroll deduction or any other auto-deduction procedures), relevant government agencies, credit bureaus, banks and financial institutions, collection agencies, and other entities.</w:t>
+      </w:r>
+    </w:p>
+    <w:p>
+      <w:pPr>
+        <w:spacing w:line="240" w:lineRule="auto"/>
+        <w:jc w:val="both"/>
+        <w:rPr>
+          <w:sz w:val="15"/>
+          <w:szCs w:val="15"/>
+        </w:rPr>
+      </w:pPr>
+    </w:p>
+    <w:p>
+      <w:pPr>
+        <w:spacing w:line="240" w:lineRule="auto"/>
+        <w:jc w:val="both"/>
+        <w:rPr>
+          <w:sz w:val="15"/>
+          <w:szCs w:val="15"/>
+        </w:rPr>
+      </w:pPr>
+      <w:r>
+        <w:rPr>
+          <w:sz w:val="15"/>
+          <w:szCs w:val="15"/>
+        </w:rPr>
+        <w:t xml:space="preserve">3. I/We authorize Easycash, directly or through its partners, credit bureau entities and third party service providers, to collect, process, use, store, disclose and share my/our personal data including but not limited to my/our name/s, age/s, birthdate/s, birthplace/s or ethnic origin/s, religion, civil status/es, spouse’s details, educational background/s, family background/s, preferences, </w:t>
+      </w:r>
+      <w:proofErr w:type="spellStart"/>
+      <w:r>
+        <w:rPr>
+          <w:sz w:val="15"/>
+          <w:szCs w:val="15"/>
+        </w:rPr>
+        <w:t>behaviour</w:t>
+      </w:r>
+      <w:proofErr w:type="spellEnd"/>
+      <w:r>
+        <w:rPr>
+          <w:sz w:val="15"/>
+          <w:szCs w:val="15"/>
+        </w:rPr>
+        <w:t>, photographs, fingerprints, other biometric data (facial recognition and voice recognition), employment and or business details, income, financial data, and other information that I/We indicated in the application form. I/We allow the use of these information for verification, credit and risk management, credit scoring, know your customer checks, prevention and detection of fraud or crime, data analytics, automated and or manual processing of the loan, credit or financial accommodation application/s, data profiling, account review, upselling and cross-selling, direct marketing, complaints management, insurance, audit and administrative purposes, relationship management, system or product development and planning among other purposes as well as collecting and establishing applicable interest and amount.</w:t>
+      </w:r>
+    </w:p>
+    <w:p>
+      <w:pPr>
+        <w:spacing w:line="240" w:lineRule="auto"/>
+        <w:jc w:val="both"/>
+        <w:rPr>
+          <w:sz w:val="15"/>
+          <w:szCs w:val="15"/>
+        </w:rPr>
+      </w:pPr>
+    </w:p>
+    <w:p>
+      <w:pPr>
+        <w:spacing w:line="240" w:lineRule="auto"/>
+        <w:jc w:val="both"/>
+        <w:rPr>
+          <w:sz w:val="15"/>
+          <w:szCs w:val="15"/>
+        </w:rPr>
+      </w:pPr>
+      <w:r>
+        <w:rPr>
+          <w:sz w:val="15"/>
+          <w:szCs w:val="15"/>
+        </w:rPr>
+        <w:t xml:space="preserve">4. I/We allow Easycash to share my/our personal data with </w:t>
+      </w:r>
+      <w:proofErr w:type="spellStart"/>
+      <w:proofErr w:type="gramStart"/>
+      <w:r>
+        <w:rPr>
+          <w:sz w:val="15"/>
+          <w:szCs w:val="15"/>
+        </w:rPr>
+        <w:t>Easycash‘</w:t>
+      </w:r>
+      <w:proofErr w:type="gramEnd"/>
+      <w:r>
+        <w:rPr>
+          <w:sz w:val="15"/>
+          <w:szCs w:val="15"/>
+        </w:rPr>
+        <w:t>s</w:t>
+      </w:r>
+      <w:proofErr w:type="spellEnd"/>
+      <w:r>
+        <w:rPr>
+          <w:sz w:val="15"/>
+          <w:szCs w:val="15"/>
+        </w:rPr>
+        <w:t xml:space="preserve"> subsidiaries, partners, credit bureau entities, and third-party service providers. I/We understand that these personal data will be utilized for verification, credit and risk management, credit scoring, know your customer checks, prevention and detection of fraud or crime, data analytics, automated and or manual processing of the loan, credit or financial accommodation application/s, data profiling, account review, upselling and cross-selling, direct marketing, complaints management, insurance, audit and administrative purposes, relationship management, system or product development and planning among other purposes as well as collecting and establishing applicable interest and amount.</w:t>
+      </w:r>
+    </w:p>
+    <w:p>
+      <w:pPr>
+        <w:spacing w:line="240" w:lineRule="auto"/>
+        <w:jc w:val="both"/>
+        <w:rPr>
+          <w:sz w:val="15"/>
+          <w:szCs w:val="15"/>
+        </w:rPr>
+      </w:pPr>
+    </w:p>
+    <w:p>
+      <w:pPr>
+        <w:spacing w:line="240" w:lineRule="auto"/>
+        <w:jc w:val="both"/>
+        <w:rPr>
+          <w:sz w:val="15"/>
+          <w:szCs w:val="15"/>
+        </w:rPr>
+      </w:pPr>
+      <w:r>
+        <w:rPr>
+          <w:sz w:val="15"/>
+          <w:szCs w:val="15"/>
+        </w:rPr>
+        <w:t xml:space="preserve">5. I/We authorize </w:t>
+      </w:r>
+      <w:proofErr w:type="spellStart"/>
+      <w:r>
+        <w:rPr>
+          <w:sz w:val="15"/>
+          <w:szCs w:val="15"/>
+        </w:rPr>
+        <w:t>Easycash’s</w:t>
+      </w:r>
+      <w:proofErr w:type="spellEnd"/>
+      <w:r>
+        <w:rPr>
+          <w:sz w:val="15"/>
+          <w:szCs w:val="15"/>
+        </w:rPr>
+        <w:t xml:space="preserve"> subsidiaries, partners, credit bureau entities and third party service providers to share with Easycash, its affiliates or subsidiaries, my/our personal data for authentication and verification, credit and risk management, credit scoring, know your customer checks, prevention and detection of fraud or crime, data analytics, automated and or manual processing of the loan, credit or financial accommodation application/s, data profiling, review, upselling and cross-selling, direct marketing, complaints management, insurance, audit and administrative purposes, relationship management, system or product development and planning among other purposes as well as collecting and establishing applicable interest and amount.</w:t>
+      </w:r>
+    </w:p>
+    <w:p>
+      <w:pPr>
+        <w:spacing w:line="240" w:lineRule="auto"/>
+        <w:jc w:val="both"/>
+        <w:rPr>
+          <w:sz w:val="15"/>
+          <w:szCs w:val="15"/>
+        </w:rPr>
+      </w:pPr>
+    </w:p>
+    <w:p>
+      <w:pPr>
+        <w:spacing w:line="240" w:lineRule="auto"/>
+        <w:jc w:val="both"/>
+        <w:rPr>
+          <w:sz w:val="15"/>
+          <w:szCs w:val="15"/>
+        </w:rPr>
+      </w:pPr>
+      <w:r>
+        <w:rPr>
+          <w:sz w:val="15"/>
+          <w:szCs w:val="15"/>
+        </w:rPr>
+        <w:t xml:space="preserve">6. I/We give consent to Easycash and its subsidiaries, partners, credit bureau entities and third party service providers for them to contact me/us by means of personal visit, phone call and or send me/us messages, notices, announcements through pre-recorded voice and or video messages, fax, MMS/SMS, email, postal mail, or any other means of communication for: (a) updating me/us about the status of my/our loan, credit and or financial accommodation application and or account; (b) collection purpose; (c) marketing and or cross selling or upselling of </w:t>
+      </w:r>
+      <w:proofErr w:type="spellStart"/>
+      <w:r>
+        <w:rPr>
+          <w:sz w:val="15"/>
+          <w:szCs w:val="15"/>
+        </w:rPr>
+        <w:t>Easycash’s</w:t>
+      </w:r>
+      <w:proofErr w:type="spellEnd"/>
+      <w:r>
+        <w:rPr>
+          <w:sz w:val="15"/>
+          <w:szCs w:val="15"/>
+        </w:rPr>
+        <w:t xml:space="preserve"> other products and services; and (d) for any other legal purpose. I/We also authorize Easycash and affiliates, subsidiaries, partners, credit bureau entities, and third-party service providers to record the telephone conversations or any conversation with its employees, representatives, or agents. Furthermore, I/We agree to hold Easycash not liable to any loss, injury, or damage that I/We may suffer in relation to any means of communication specified above from Easycash.</w:t>
+      </w:r>
+    </w:p>
+    <w:p>
+      <w:pPr>
+        <w:spacing w:line="240" w:lineRule="auto"/>
+        <w:jc w:val="both"/>
+        <w:rPr>
+          <w:sz w:val="15"/>
+          <w:szCs w:val="15"/>
+        </w:rPr>
+      </w:pPr>
+    </w:p>
+    <w:p>
+      <w:pPr>
+        <w:spacing w:line="240" w:lineRule="auto"/>
+        <w:jc w:val="both"/>
+        <w:rPr>
+          <w:sz w:val="15"/>
+          <w:szCs w:val="15"/>
+        </w:rPr>
+      </w:pPr>
+      <w:r>
+        <w:rPr>
+          <w:sz w:val="15"/>
+          <w:szCs w:val="15"/>
+        </w:rPr>
+        <w:t>7. I/We authorize Easycash to maintain copy/</w:t>
+      </w:r>
+      <w:proofErr w:type="spellStart"/>
+      <w:r>
+        <w:rPr>
+          <w:sz w:val="15"/>
+          <w:szCs w:val="15"/>
+        </w:rPr>
+        <w:t>ies</w:t>
+      </w:r>
+      <w:proofErr w:type="spellEnd"/>
+      <w:r>
+        <w:rPr>
+          <w:sz w:val="15"/>
+          <w:szCs w:val="15"/>
+        </w:rPr>
+        <w:t xml:space="preserve"> of my/our personal data, pertinent information, and other documents for up to five (5) years for Easycash to perform its sanctioned objectives and purposes effectively, legal claims, or any other purpose as provided by law. I/We are also informed that all of my/our personal data may continue to be collected, stored, processed and or shared for up to five (5) years from the conclusion of my/our transactions with Easycash, its subsidiaries, partners, credit bureau entities and </w:t>
+      </w:r>
+      <w:proofErr w:type="gramStart"/>
+      <w:r>
+        <w:rPr>
+          <w:sz w:val="15"/>
+          <w:szCs w:val="15"/>
+        </w:rPr>
+        <w:t>third party</w:t>
+      </w:r>
+      <w:proofErr w:type="gramEnd"/>
+      <w:r>
+        <w:rPr>
+          <w:sz w:val="15"/>
+          <w:szCs w:val="15"/>
+        </w:rPr>
+        <w:t xml:space="preserve"> service providers or until the expiration of the retention limits set by applicable laws, whichever comes later.</w:t>
       </w:r>
     </w:p>
     <w:p>
@@ -477,7 +648,23 @@
           <w:sz w:val="15"/>
           <w:szCs w:val="15"/>
         </w:rPr>
-        <w:t>11. This is to inform that the consent I/We provided is subject to data privacy laws, rules, and regulations. I/We moreover understand that I/We can contact Easycash to request for information, access to, and correction of my/your personal data and I/We know of my/our right to decline any further processing, except as may be required to continue my/our existing loan, credit or financial accommodation application and or account with Easycash by sending a mail addressed to the Data Protection and Compliance Officer through Easycash’s postal address of Unit 9 Ground Floor The Midland Plaza M Adriatico Barangay 669 Ermita Manila.</w:t>
+        <w:t xml:space="preserve">11. This is to inform that the consent I/We provided is subject to data privacy laws, rules, and regulations. I/We moreover understand that I/We can contact Easycash to request for information, access to, and correction of my/your personal data and I/We know of my/our right to decline any further processing, except as may be required to continue my/our existing loan, credit or financial accommodation application and or account with Easycash by sending a mail addressed to the Data Protection and Compliance Officer through </w:t>
+      </w:r>
+      <w:proofErr w:type="spellStart"/>
+      <w:r>
+        <w:rPr>
+          <w:sz w:val="15"/>
+          <w:szCs w:val="15"/>
+        </w:rPr>
+        <w:t>Easycash’s</w:t>
+      </w:r>
+      <w:proofErr w:type="spellEnd"/>
+      <w:r>
+        <w:rPr>
+          <w:sz w:val="15"/>
+          <w:szCs w:val="15"/>
+        </w:rPr>
+        <w:t xml:space="preserve"> postal address of Unit 9 Ground Floor The Midland Plaza M Adriatico Barangay 669 Ermita Manila.</w:t>
       </w:r>
     </w:p>
     <w:p>
@@ -602,7 +789,29 @@
                 <w:szCs w:val="16"/>
                 <w:u w:val="single"/>
               </w:rPr>
-              <w:t>{BorrowerName}</w:t>
+              <w:t>{</w:t>
+            </w:r>
+            <w:proofErr w:type="spellStart"/>
+            <w:r>
+              <w:rPr>
+                <w:b/>
+                <w:bCs/>
+                <w:sz w:val="16"/>
+                <w:szCs w:val="16"/>
+                <w:u w:val="single"/>
+              </w:rPr>
+              <w:t>BorrowerName</w:t>
+            </w:r>
+            <w:proofErr w:type="spellEnd"/>
+            <w:r>
+              <w:rPr>
+                <w:b/>
+                <w:bCs/>
+                <w:sz w:val="16"/>
+                <w:szCs w:val="16"/>
+                <w:u w:val="single"/>
+              </w:rPr>
+              <w:t>}</w:t>
             </w:r>
           </w:p>
           <w:p>

</xml_diff>

<commit_message>
feat(loan-document): placeholders for Deed of Assignment/SPOA/Manulife/Data Privacy templates
DATA_PRIVACY_CONSENT, DEED_OF_ASSIGNMENT_BORROWER/CO_BORROWER/SALARY,
and SPECIAL_POWER_OF_ATTORNEY now use {Address}, {AnticipatedDisbursementDate},
{PNNumber}, {TotalPaymentDue}/{TotalPaymentDueWords}, and {CoBorrowerName}
where applicable - all existing merge fields, no backend changes needed.

Also adds legacy/Sync Database And Apply Migrations.bat: same restore
flow as the existing Sync Database From Export.bat, but runs `prisma
migrate deploy` right after the pg_restore step so schema additions
(e.g. anticipatedDisbursementDate) survive a colleague's older DB
export instead of being dropped by --clean. Lives in legacy/, so
ROOT_DIR resolves via `pushd "%~dp0.."` to the actual project root.

Co-Authored-By: Claude Sonnet 5 <noreply@anthropic.com>
</commit_message>
<xml_diff>
--- a/app/backend/templates/DATA_PRIVACY_CONSENT.docx
+++ b/app/backend/templates/DATA_PRIVACY_CONSENT.docx
@@ -162,39 +162,7 @@
           <w:sz w:val="15"/>
           <w:szCs w:val="15"/>
         </w:rPr>
-        <w:t xml:space="preserve">I/We are fully informed through this Data Privacy Statement and Consent of </w:t>
-      </w:r>
-      <w:proofErr w:type="spellStart"/>
-      <w:r>
-        <w:rPr>
-          <w:sz w:val="15"/>
-          <w:szCs w:val="15"/>
-        </w:rPr>
-        <w:t>Easycash’s</w:t>
-      </w:r>
-      <w:proofErr w:type="spellEnd"/>
-      <w:r>
-        <w:rPr>
-          <w:sz w:val="15"/>
-          <w:szCs w:val="15"/>
-        </w:rPr>
-        <w:t xml:space="preserve"> guidelines regarding the processing of my/our personal data, which Easycash received by means of my/our loan, credit, or financial accommodation application submitted through </w:t>
-      </w:r>
-      <w:proofErr w:type="spellStart"/>
-      <w:r>
-        <w:rPr>
-          <w:sz w:val="15"/>
-          <w:szCs w:val="15"/>
-        </w:rPr>
-        <w:t>Easycash’s</w:t>
-      </w:r>
-      <w:proofErr w:type="spellEnd"/>
-      <w:r>
-        <w:rPr>
-          <w:sz w:val="15"/>
-          <w:szCs w:val="15"/>
-        </w:rPr>
-        <w:t xml:space="preserve"> office, website, or mobile application. I/We understand that all information that I/We declared and indicated for the purpose of obtaining loan, credit or any other financial accommodation may be used for verification, credit and risk management, credit scoring, know your customer checks, prevention and detection of fraud or crime, data analytics, automated and or manual processing of the loan, credit or financial accommodation application/s, data profiling, account review, upselling and cross-selling, direct marketing, complaints management, insurance, audit and administrative purposes, relationship management, system or product development and planning among other purposes and will be strictly kept confidential.</w:t>
+        <w:t>I/We are fully informed through this Data Privacy Statement and Consent of Easycash’s guidelines regarding the processing of my/our personal data, which Easycash received by means of my/our loan, credit, or financial accommodation application submitted through Easycash’s office, website, or mobile application. I/We understand that all information that I/We declared and indicated for the purpose of obtaining loan, credit or any other financial accommodation may be used for verification, credit and risk management, credit scoring, know your customer checks, prevention and detection of fraud or crime, data analytics, automated and or manual processing of the loan, credit or financial accommodation application/s, data profiling, account review, upselling and cross-selling, direct marketing, complaints management, insurance, audit and administrative purposes, relationship management, system or product development and planning among other purposes and will be strictly kept confidential.</w:t>
       </w:r>
     </w:p>
     <w:p>
@@ -266,281 +234,142 @@
           <w:sz w:val="15"/>
           <w:szCs w:val="15"/>
         </w:rPr>
-        <w:t xml:space="preserve">2. I/We understand that Easycash works with partners, credit bureau entities, and third-party service providers to effectively serve its clients, including me/us. I/We are informed that </w:t>
-      </w:r>
-      <w:proofErr w:type="spellStart"/>
-      <w:r>
-        <w:rPr>
-          <w:sz w:val="15"/>
-          <w:szCs w:val="15"/>
-        </w:rPr>
-        <w:t>Easycash’s</w:t>
-      </w:r>
-      <w:proofErr w:type="spellEnd"/>
-      <w:r>
-        <w:rPr>
-          <w:sz w:val="15"/>
-          <w:szCs w:val="15"/>
-        </w:rPr>
-        <w:t xml:space="preserve"> partners, credit bureau </w:t>
-      </w:r>
-      <w:proofErr w:type="spellStart"/>
-      <w:proofErr w:type="gramStart"/>
-      <w:r>
-        <w:rPr>
-          <w:sz w:val="15"/>
-          <w:szCs w:val="15"/>
-        </w:rPr>
-        <w:t>entities,s</w:t>
-      </w:r>
-      <w:proofErr w:type="spellEnd"/>
-      <w:proofErr w:type="gramEnd"/>
-      <w:r>
-        <w:rPr>
-          <w:sz w:val="15"/>
-          <w:szCs w:val="15"/>
-        </w:rPr>
-        <w:t xml:space="preserve"> and third-party service providers may include my/our employer, whether private or government (for payroll deduction or any other auto-deduction procedures), relevant government agencies, credit bureaus, banks and financial institutions, collection agencies, and other entities.</w:t>
-      </w:r>
-    </w:p>
-    <w:p>
-      <w:pPr>
-        <w:spacing w:line="240" w:lineRule="auto"/>
-        <w:jc w:val="both"/>
-        <w:rPr>
-          <w:sz w:val="15"/>
-          <w:szCs w:val="15"/>
-        </w:rPr>
-      </w:pPr>
-    </w:p>
-    <w:p>
-      <w:pPr>
-        <w:spacing w:line="240" w:lineRule="auto"/>
-        <w:jc w:val="both"/>
-        <w:rPr>
-          <w:sz w:val="15"/>
-          <w:szCs w:val="15"/>
-        </w:rPr>
-      </w:pPr>
-      <w:r>
-        <w:rPr>
-          <w:sz w:val="15"/>
-          <w:szCs w:val="15"/>
-        </w:rPr>
-        <w:t xml:space="preserve">3. I/We authorize Easycash, directly or through its partners, credit bureau entities and third party service providers, to collect, process, use, store, disclose and share my/our personal data including but not limited to my/our name/s, age/s, birthdate/s, birthplace/s or ethnic origin/s, religion, civil status/es, spouse’s details, educational background/s, family background/s, preferences, </w:t>
-      </w:r>
-      <w:proofErr w:type="spellStart"/>
-      <w:r>
-        <w:rPr>
-          <w:sz w:val="15"/>
-          <w:szCs w:val="15"/>
-        </w:rPr>
-        <w:t>behaviour</w:t>
-      </w:r>
-      <w:proofErr w:type="spellEnd"/>
-      <w:r>
-        <w:rPr>
-          <w:sz w:val="15"/>
-          <w:szCs w:val="15"/>
-        </w:rPr>
-        <w:t>, photographs, fingerprints, other biometric data (facial recognition and voice recognition), employment and or business details, income, financial data, and other information that I/We indicated in the application form. I/We allow the use of these information for verification, credit and risk management, credit scoring, know your customer checks, prevention and detection of fraud or crime, data analytics, automated and or manual processing of the loan, credit or financial accommodation application/s, data profiling, account review, upselling and cross-selling, direct marketing, complaints management, insurance, audit and administrative purposes, relationship management, system or product development and planning among other purposes as well as collecting and establishing applicable interest and amount.</w:t>
-      </w:r>
-    </w:p>
-    <w:p>
-      <w:pPr>
-        <w:spacing w:line="240" w:lineRule="auto"/>
-        <w:jc w:val="both"/>
-        <w:rPr>
-          <w:sz w:val="15"/>
-          <w:szCs w:val="15"/>
-        </w:rPr>
-      </w:pPr>
-    </w:p>
-    <w:p>
-      <w:pPr>
-        <w:spacing w:line="240" w:lineRule="auto"/>
-        <w:jc w:val="both"/>
-        <w:rPr>
-          <w:sz w:val="15"/>
-          <w:szCs w:val="15"/>
-        </w:rPr>
-      </w:pPr>
-      <w:r>
-        <w:rPr>
-          <w:sz w:val="15"/>
-          <w:szCs w:val="15"/>
-        </w:rPr>
-        <w:t xml:space="preserve">4. I/We allow Easycash to share my/our personal data with </w:t>
-      </w:r>
-      <w:proofErr w:type="spellStart"/>
-      <w:proofErr w:type="gramStart"/>
-      <w:r>
-        <w:rPr>
-          <w:sz w:val="15"/>
-          <w:szCs w:val="15"/>
-        </w:rPr>
-        <w:t>Easycash‘</w:t>
-      </w:r>
-      <w:proofErr w:type="gramEnd"/>
-      <w:r>
-        <w:rPr>
-          <w:sz w:val="15"/>
-          <w:szCs w:val="15"/>
-        </w:rPr>
-        <w:t>s</w:t>
-      </w:r>
-      <w:proofErr w:type="spellEnd"/>
-      <w:r>
-        <w:rPr>
-          <w:sz w:val="15"/>
-          <w:szCs w:val="15"/>
-        </w:rPr>
-        <w:t xml:space="preserve"> subsidiaries, partners, credit bureau entities, and third-party service providers. I/We understand that these personal data will be utilized for verification, credit and risk management, credit scoring, know your customer checks, prevention and detection of fraud or crime, data analytics, automated and or manual processing of the loan, credit or financial accommodation application/s, data profiling, account review, upselling and cross-selling, direct marketing, complaints management, insurance, audit and administrative purposes, relationship management, system or product development and planning among other purposes as well as collecting and establishing applicable interest and amount.</w:t>
-      </w:r>
-    </w:p>
-    <w:p>
-      <w:pPr>
-        <w:spacing w:line="240" w:lineRule="auto"/>
-        <w:jc w:val="both"/>
-        <w:rPr>
-          <w:sz w:val="15"/>
-          <w:szCs w:val="15"/>
-        </w:rPr>
-      </w:pPr>
-    </w:p>
-    <w:p>
-      <w:pPr>
-        <w:spacing w:line="240" w:lineRule="auto"/>
-        <w:jc w:val="both"/>
-        <w:rPr>
-          <w:sz w:val="15"/>
-          <w:szCs w:val="15"/>
-        </w:rPr>
-      </w:pPr>
-      <w:r>
-        <w:rPr>
-          <w:sz w:val="15"/>
-          <w:szCs w:val="15"/>
-        </w:rPr>
-        <w:t xml:space="preserve">5. I/We authorize </w:t>
-      </w:r>
-      <w:proofErr w:type="spellStart"/>
-      <w:r>
-        <w:rPr>
-          <w:sz w:val="15"/>
-          <w:szCs w:val="15"/>
-        </w:rPr>
-        <w:t>Easycash’s</w:t>
-      </w:r>
-      <w:proofErr w:type="spellEnd"/>
-      <w:r>
-        <w:rPr>
-          <w:sz w:val="15"/>
-          <w:szCs w:val="15"/>
-        </w:rPr>
-        <w:t xml:space="preserve"> subsidiaries, partners, credit bureau entities and third party service providers to share with Easycash, its affiliates or subsidiaries, my/our personal data for authentication and verification, credit and risk management, credit scoring, know your customer checks, prevention and detection of fraud or crime, data analytics, automated and or manual processing of the loan, credit or financial accommodation application/s, data profiling, review, upselling and cross-selling, direct marketing, complaints management, insurance, audit and administrative purposes, relationship management, system or product development and planning among other purposes as well as collecting and establishing applicable interest and amount.</w:t>
-      </w:r>
-    </w:p>
-    <w:p>
-      <w:pPr>
-        <w:spacing w:line="240" w:lineRule="auto"/>
-        <w:jc w:val="both"/>
-        <w:rPr>
-          <w:sz w:val="15"/>
-          <w:szCs w:val="15"/>
-        </w:rPr>
-      </w:pPr>
-    </w:p>
-    <w:p>
-      <w:pPr>
-        <w:spacing w:line="240" w:lineRule="auto"/>
-        <w:jc w:val="both"/>
-        <w:rPr>
-          <w:sz w:val="15"/>
-          <w:szCs w:val="15"/>
-        </w:rPr>
-      </w:pPr>
-      <w:r>
-        <w:rPr>
-          <w:sz w:val="15"/>
-          <w:szCs w:val="15"/>
-        </w:rPr>
-        <w:t xml:space="preserve">6. I/We give consent to Easycash and its subsidiaries, partners, credit bureau entities and third party service providers for them to contact me/us by means of personal visit, phone call and or send me/us messages, notices, announcements through pre-recorded voice and or video messages, fax, MMS/SMS, email, postal mail, or any other means of communication for: (a) updating me/us about the status of my/our loan, credit and or financial accommodation application and or account; (b) collection purpose; (c) marketing and or cross selling or upselling of </w:t>
-      </w:r>
-      <w:proofErr w:type="spellStart"/>
-      <w:r>
-        <w:rPr>
-          <w:sz w:val="15"/>
-          <w:szCs w:val="15"/>
-        </w:rPr>
-        <w:t>Easycash’s</w:t>
-      </w:r>
-      <w:proofErr w:type="spellEnd"/>
-      <w:r>
-        <w:rPr>
-          <w:sz w:val="15"/>
-          <w:szCs w:val="15"/>
-        </w:rPr>
-        <w:t xml:space="preserve"> other products and services; and (d) for any other legal purpose. I/We also authorize Easycash and affiliates, subsidiaries, partners, credit bureau entities, and third-party service providers to record the telephone conversations or any conversation with its employees, representatives, or agents. Furthermore, I/We agree to hold Easycash not liable to any loss, injury, or damage that I/We may suffer in relation to any means of communication specified above from Easycash.</w:t>
-      </w:r>
-    </w:p>
-    <w:p>
-      <w:pPr>
-        <w:spacing w:line="240" w:lineRule="auto"/>
-        <w:jc w:val="both"/>
-        <w:rPr>
-          <w:sz w:val="15"/>
-          <w:szCs w:val="15"/>
-        </w:rPr>
-      </w:pPr>
-    </w:p>
-    <w:p>
-      <w:pPr>
-        <w:spacing w:line="240" w:lineRule="auto"/>
-        <w:jc w:val="both"/>
-        <w:rPr>
-          <w:sz w:val="15"/>
-          <w:szCs w:val="15"/>
-        </w:rPr>
-      </w:pPr>
-      <w:r>
-        <w:rPr>
-          <w:sz w:val="15"/>
-          <w:szCs w:val="15"/>
-        </w:rPr>
-        <w:t>7. I/We authorize Easycash to maintain copy/</w:t>
-      </w:r>
-      <w:proofErr w:type="spellStart"/>
-      <w:r>
-        <w:rPr>
-          <w:sz w:val="15"/>
-          <w:szCs w:val="15"/>
-        </w:rPr>
-        <w:t>ies</w:t>
-      </w:r>
-      <w:proofErr w:type="spellEnd"/>
-      <w:r>
-        <w:rPr>
-          <w:sz w:val="15"/>
-          <w:szCs w:val="15"/>
-        </w:rPr>
-        <w:t xml:space="preserve"> of my/our personal data, pertinent information, and other documents for up to five (5) years for Easycash to perform its sanctioned objectives and purposes effectively, legal claims, or any other purpose as provided by law. I/We are also informed that all of my/our personal data may continue to be collected, stored, processed and or shared for up to five (5) years from the conclusion of my/our transactions with Easycash, its subsidiaries, partners, credit bureau entities and </w:t>
-      </w:r>
-      <w:proofErr w:type="gramStart"/>
-      <w:r>
-        <w:rPr>
-          <w:sz w:val="15"/>
-          <w:szCs w:val="15"/>
-        </w:rPr>
-        <w:t>third party</w:t>
-      </w:r>
-      <w:proofErr w:type="gramEnd"/>
-      <w:r>
-        <w:rPr>
-          <w:sz w:val="15"/>
-          <w:szCs w:val="15"/>
-        </w:rPr>
-        <w:t xml:space="preserve"> service providers or until the expiration of the retention limits set by applicable laws, whichever comes later.</w:t>
+        <w:t>2. I/We understand that Easycash works with partners, credit bureau entities, and third-party service providers to effectively serve its clients, including me/us. I/We are informed that Easycash’s partners, credit bureau entities,s and third-party service providers may include my/our employer, whether private or government (for payroll deduction or any other auto-deduction procedures), relevant government agencies, credit bureaus, banks and financial institutions, collection agencies, and other entities.</w:t>
+      </w:r>
+    </w:p>
+    <w:p>
+      <w:pPr>
+        <w:spacing w:line="240" w:lineRule="auto"/>
+        <w:jc w:val="both"/>
+        <w:rPr>
+          <w:sz w:val="15"/>
+          <w:szCs w:val="15"/>
+        </w:rPr>
+      </w:pPr>
+    </w:p>
+    <w:p>
+      <w:pPr>
+        <w:spacing w:line="240" w:lineRule="auto"/>
+        <w:jc w:val="both"/>
+        <w:rPr>
+          <w:sz w:val="15"/>
+          <w:szCs w:val="15"/>
+        </w:rPr>
+      </w:pPr>
+      <w:r>
+        <w:rPr>
+          <w:sz w:val="15"/>
+          <w:szCs w:val="15"/>
+        </w:rPr>
+        <w:t>3. I/We authorize Easycash, directly or through its partners, credit bureau entities and third party service providers, to collect, process, use, store, disclose and share my/our personal data including but not limited to my/our name/s, age/s, birthdate/s, birthplace/s or ethnic origin/s, religion, civil status/es, spouse’s details, educational background/s, family background/s, preferences, behaviour, photographs, fingerprints, other biometric data (facial recognition and voice recognition), employment and or business details, income, financial data, and other information that I/We indicated in the application form. I/We allow the use of these information for verification, credit and risk management, credit scoring, know your customer checks, prevention and detection of fraud or crime, data analytics, automated and or manual processing of the loan, credit or financial accommodation application/s, data profiling, account review, upselling and cross-selling, direct marketing, complaints management, insurance, audit and administrative purposes, relationship management, system or product development and planning among other purposes as well as collecting and establishing applicable interest and amount.</w:t>
+      </w:r>
+    </w:p>
+    <w:p>
+      <w:pPr>
+        <w:spacing w:line="240" w:lineRule="auto"/>
+        <w:jc w:val="both"/>
+        <w:rPr>
+          <w:sz w:val="15"/>
+          <w:szCs w:val="15"/>
+        </w:rPr>
+      </w:pPr>
+    </w:p>
+    <w:p>
+      <w:pPr>
+        <w:spacing w:line="240" w:lineRule="auto"/>
+        <w:jc w:val="both"/>
+        <w:rPr>
+          <w:sz w:val="15"/>
+          <w:szCs w:val="15"/>
+        </w:rPr>
+      </w:pPr>
+      <w:r>
+        <w:rPr>
+          <w:sz w:val="15"/>
+          <w:szCs w:val="15"/>
+        </w:rPr>
+        <w:t>4. I/We allow Easycash to share my/our personal data with Easycash‘s subsidiaries, partners, credit bureau entities, and third-party service providers. I/We understand that these personal data will be utilized for verification, credit and risk management, credit scoring, know your customer checks, prevention and detection of fraud or crime, data analytics, automated and or manual processing of the loan, credit or financial accommodation application/s, data profiling, account review, upselling and cross-selling, direct marketing, complaints management, insurance, audit and administrative purposes, relationship management, system or product development and planning among other purposes as well as collecting and establishing applicable interest and amount.</w:t>
+      </w:r>
+    </w:p>
+    <w:p>
+      <w:pPr>
+        <w:spacing w:line="240" w:lineRule="auto"/>
+        <w:jc w:val="both"/>
+        <w:rPr>
+          <w:sz w:val="15"/>
+          <w:szCs w:val="15"/>
+        </w:rPr>
+      </w:pPr>
+    </w:p>
+    <w:p>
+      <w:pPr>
+        <w:spacing w:line="240" w:lineRule="auto"/>
+        <w:jc w:val="both"/>
+        <w:rPr>
+          <w:sz w:val="15"/>
+          <w:szCs w:val="15"/>
+        </w:rPr>
+      </w:pPr>
+      <w:r>
+        <w:rPr>
+          <w:sz w:val="15"/>
+          <w:szCs w:val="15"/>
+        </w:rPr>
+        <w:t>5. I/We authorize Easycash’s subsidiaries, partners, credit bureau entities and third party service providers to share with Easycash, its affiliates or subsidiaries, my/our personal data for authentication and verification, credit and risk management, credit scoring, know your customer checks, prevention and detection of fraud or crime, data analytics, automated and or manual processing of the loan, credit or financial accommodation application/s, data profiling, review, upselling and cross-selling, direct marketing, complaints management, insurance, audit and administrative purposes, relationship management, system or product development and planning among other purposes as well as collecting and establishing applicable interest and amount.</w:t>
+      </w:r>
+    </w:p>
+    <w:p>
+      <w:pPr>
+        <w:spacing w:line="240" w:lineRule="auto"/>
+        <w:jc w:val="both"/>
+        <w:rPr>
+          <w:sz w:val="15"/>
+          <w:szCs w:val="15"/>
+        </w:rPr>
+      </w:pPr>
+    </w:p>
+    <w:p>
+      <w:pPr>
+        <w:spacing w:line="240" w:lineRule="auto"/>
+        <w:jc w:val="both"/>
+        <w:rPr>
+          <w:sz w:val="15"/>
+          <w:szCs w:val="15"/>
+        </w:rPr>
+      </w:pPr>
+      <w:r>
+        <w:rPr>
+          <w:sz w:val="15"/>
+          <w:szCs w:val="15"/>
+        </w:rPr>
+        <w:t>6. I/We give consent to Easycash and its subsidiaries, partners, credit bureau entities and third party service providers for them to contact me/us by means of personal visit, phone call and or send me/us messages, notices, announcements through pre-recorded voice and or video messages, fax, MMS/SMS, email, postal mail, or any other means of communication for: (a) updating me/us about the status of my/our loan, credit and or financial accommodation application and or account; (b) collection purpose; (c) marketing and or cross selling or upselling of Easycash’s other products and services; and (d) for any other legal purpose. I/We also authorize Easycash and affiliates, subsidiaries, partners, credit bureau entities, and third-party service providers to record the telephone conversations or any conversation with its employees, representatives, or agents. Furthermore, I/We agree to hold Easycash not liable to any loss, injury, or damage that I/We may suffer in relation to any means of communication specified above from Easycash.</w:t>
+      </w:r>
+    </w:p>
+    <w:p>
+      <w:pPr>
+        <w:spacing w:line="240" w:lineRule="auto"/>
+        <w:jc w:val="both"/>
+        <w:rPr>
+          <w:sz w:val="15"/>
+          <w:szCs w:val="15"/>
+        </w:rPr>
+      </w:pPr>
+    </w:p>
+    <w:p>
+      <w:pPr>
+        <w:spacing w:line="240" w:lineRule="auto"/>
+        <w:jc w:val="both"/>
+        <w:rPr>
+          <w:sz w:val="15"/>
+          <w:szCs w:val="15"/>
+        </w:rPr>
+      </w:pPr>
+      <w:r>
+        <w:rPr>
+          <w:sz w:val="15"/>
+          <w:szCs w:val="15"/>
+        </w:rPr>
+        <w:t>7. I/We authorize Easycash to maintain copy/ies of my/our personal data, pertinent information, and other documents for up to five (5) years for Easycash to perform its sanctioned objectives and purposes effectively, legal claims, or any other purpose as provided by law. I/We are also informed that all of my/our personal data may continue to be collected, stored, processed and or shared for up to five (5) years from the conclusion of my/our transactions with Easycash, its subsidiaries, partners, credit bureau entities and third party service providers or until the expiration of the retention limits set by applicable laws, whichever comes later.</w:t>
       </w:r>
     </w:p>
     <w:p>
@@ -648,23 +477,7 @@
           <w:sz w:val="15"/>
           <w:szCs w:val="15"/>
         </w:rPr>
-        <w:t xml:space="preserve">11. This is to inform that the consent I/We provided is subject to data privacy laws, rules, and regulations. I/We moreover understand that I/We can contact Easycash to request for information, access to, and correction of my/your personal data and I/We know of my/our right to decline any further processing, except as may be required to continue my/our existing loan, credit or financial accommodation application and or account with Easycash by sending a mail addressed to the Data Protection and Compliance Officer through </w:t>
-      </w:r>
-      <w:proofErr w:type="spellStart"/>
-      <w:r>
-        <w:rPr>
-          <w:sz w:val="15"/>
-          <w:szCs w:val="15"/>
-        </w:rPr>
-        <w:t>Easycash’s</w:t>
-      </w:r>
-      <w:proofErr w:type="spellEnd"/>
-      <w:r>
-        <w:rPr>
-          <w:sz w:val="15"/>
-          <w:szCs w:val="15"/>
-        </w:rPr>
-        <w:t xml:space="preserve"> postal address of Unit 9 Ground Floor The Midland Plaza M Adriatico Barangay 669 Ermita Manila.</w:t>
+        <w:t>11. This is to inform that the consent I/We provided is subject to data privacy laws, rules, and regulations. I/We moreover understand that I/We can contact Easycash to request for information, access to, and correction of my/your personal data and I/We know of my/our right to decline any further processing, except as may be required to continue my/our existing loan, credit or financial accommodation application and or account with Easycash by sending a mail addressed to the Data Protection and Compliance Officer through Easycash’s postal address of Unit 9 Ground Floor The Midland Plaza M Adriatico Barangay 669 Ermita Manila.</w:t>
       </w:r>
     </w:p>
     <w:p>
@@ -789,29 +602,7 @@
                 <w:szCs w:val="16"/>
                 <w:u w:val="single"/>
               </w:rPr>
-              <w:t>{</w:t>
-            </w:r>
-            <w:proofErr w:type="spellStart"/>
-            <w:r>
-              <w:rPr>
-                <w:b/>
-                <w:bCs/>
-                <w:sz w:val="16"/>
-                <w:szCs w:val="16"/>
-                <w:u w:val="single"/>
-              </w:rPr>
-              <w:t>BorrowerName</w:t>
-            </w:r>
-            <w:proofErr w:type="spellEnd"/>
-            <w:r>
-              <w:rPr>
-                <w:b/>
-                <w:bCs/>
-                <w:sz w:val="16"/>
-                <w:szCs w:val="16"/>
-                <w:u w:val="single"/>
-              </w:rPr>
-              <w:t>}</w:t>
+              <w:t>{BorrowerName}</w:t>
             </w:r>
           </w:p>
           <w:p>
@@ -879,6 +670,16 @@
                 <w:u w:val="single"/>
               </w:rPr>
             </w:pPr>
+            <w:r>
+              <w:rPr>
+                <w:b/>
+                <w:bCs/>
+                <w:sz w:val="16"/>
+                <w:szCs w:val="16"/>
+                <w:u w:val="single"/>
+              </w:rPr>
+              <w:t>{CoBorrowerName}</w:t>
+            </w:r>
           </w:p>
           <w:p>
             <w:pPr>

</xml_diff>

<commit_message>
fix(loan-signing): audit-text/signature alignment fixes across 6 templates
Per-template TEMPLATE_OFFSETS/CO_BORROWER_TEMPLATE_OFFSETS tuning for Promissory
Note, Disclosure Statement, Loan Agreement - Seafarer, Data Privacy Consent,
Special Power of Attorney, and Deed of Assignment - Borrower, based on direct
measurement (pdf2json) against real signed PDFs shared by the user.

Also fixes two real bugs found along the way:
- A long Co-Borrower name could wrap to a second line without the lines below it
  (Sent OTP to/Date/IP address) accounting for the extra line, causing them to
  render on top of the wrapped text.
- The same wrap could also just break the "same line-spacing rhythm as the
  Borrower's block" look, even once the overlap itself was fixed - now the
  Co-Borrower's name font shrinks just enough to stay on one line instead.

Includes the user's own content edits to 8 .docx templates.

Co-Authored-By: Claude Sonnet 5 <noreply@anthropic.com>
</commit_message>
<xml_diff>
--- a/app/backend/templates/DATA_PRIVACY_CONSENT.docx
+++ b/app/backend/templates/DATA_PRIVACY_CONSENT.docx
@@ -1,6 +1,6 @@
 
 <file path=word/document.xml><?xml version="1.0" encoding="utf-8"?>
-<w:document xmlns:wpc="http://schemas.microsoft.com/office/word/2010/wordprocessingCanvas" xmlns:cx="http://schemas.microsoft.com/office/drawing/2014/chartex" xmlns:cx1="http://schemas.microsoft.com/office/drawing/2015/9/8/chartex" xmlns:cx2="http://schemas.microsoft.com/office/drawing/2015/10/21/chartex" xmlns:cx3="http://schemas.microsoft.com/office/drawing/2016/5/9/chartex" xmlns:cx4="http://schemas.microsoft.com/office/drawing/2016/5/10/chartex" xmlns:cx5="http://schemas.microsoft.com/office/drawing/2016/5/11/chartex" xmlns:cx6="http://schemas.microsoft.com/office/drawing/2016/5/12/chartex" xmlns:cx7="http://schemas.microsoft.com/office/drawing/2016/5/13/chartex" xmlns:cx8="http://schemas.microsoft.com/office/drawing/2016/5/14/chartex" xmlns:mc="http://schemas.openxmlformats.org/markup-compatibility/2006" xmlns:aink="http://schemas.microsoft.com/office/drawing/2016/ink" xmlns:am3d="http://schemas.microsoft.com/office/drawing/2017/model3d" xmlns:o="urn:schemas-microsoft-com:office:office" xmlns:oel="http://schemas.microsoft.com/office/2019/extlst" xmlns:r="http://schemas.openxmlformats.org/officeDocument/2006/relationships" xmlns:m="http://schemas.openxmlformats.org/officeDocument/2006/math" xmlns:v="urn:schemas-microsoft-com:vml" xmlns:wp14="http://schemas.microsoft.com/office/word/2010/wordprocessingDrawing" xmlns:wp="http://schemas.openxmlformats.org/drawingml/2006/wordprocessingDrawing" xmlns:w10="urn:schemas-microsoft-com:office:word" xmlns:w="http://schemas.openxmlformats.org/wordprocessingml/2006/main" xmlns:w14="http://schemas.microsoft.com/office/word/2010/wordml" xmlns:w15="http://schemas.microsoft.com/office/word/2012/wordml" xmlns:w16cex="http://schemas.microsoft.com/office/word/2018/wordml/cex" xmlns:w16cid="http://schemas.microsoft.com/office/word/2016/wordml/cid" xmlns:w16="http://schemas.microsoft.com/office/word/2018/wordml" xmlns:w16du="http://schemas.microsoft.com/office/word/2023/wordml/word16du" xmlns:w16sdtdh="http://schemas.microsoft.com/office/word/2020/wordml/sdtdatahash" xmlns:w16sdtfl="http://schemas.microsoft.com/office/word/2024/wordml/sdtformatlock" xmlns:w16se="http://schemas.microsoft.com/office/word/2015/wordml/symex" xmlns:wpg="http://schemas.microsoft.com/office/word/2010/wordprocessingGroup" xmlns:wpi="http://schemas.microsoft.com/office/word/2010/wordprocessingInk" xmlns:wne="http://schemas.microsoft.com/office/word/2006/wordml" xmlns:wps="http://schemas.microsoft.com/office/word/2010/wordprocessingShape" mc:Ignorable="w14 w15 w16se w16cid w16 w16cex w16sdtdh w16sdtfl w16du wp14">
+<w:document xmlns:wpc="http://schemas.microsoft.com/office/word/2010/wordprocessingCanvas" xmlns:cx="http://schemas.microsoft.com/office/drawing/2014/chartex" xmlns:cx1="http://schemas.microsoft.com/office/drawing/2015/9/8/chartex" xmlns:cx2="http://schemas.microsoft.com/office/drawing/2015/10/21/chartex" xmlns:cx3="http://schemas.microsoft.com/office/drawing/2016/5/9/chartex" xmlns:cx4="http://schemas.microsoft.com/office/drawing/2016/5/10/chartex" xmlns:cx5="http://schemas.microsoft.com/office/drawing/2016/5/11/chartex" xmlns:cx6="http://schemas.microsoft.com/office/drawing/2016/5/12/chartex" xmlns:cx7="http://schemas.microsoft.com/office/drawing/2016/5/13/chartex" xmlns:cx8="http://schemas.microsoft.com/office/drawing/2016/5/14/chartex" xmlns:mc="http://schemas.openxmlformats.org/markup-compatibility/2006" xmlns:aink="http://schemas.microsoft.com/office/drawing/2016/ink" xmlns:am3d="http://schemas.microsoft.com/office/drawing/2017/model3d" xmlns:o="urn:schemas-microsoft-com:office:office" xmlns:oel="http://schemas.microsoft.com/office/2019/extlst" xmlns:r="http://schemas.openxmlformats.org/officeDocument/2006/relationships" xmlns:m="http://schemas.openxmlformats.org/officeDocument/2006/math" xmlns:v="urn:schemas-microsoft-com:vml" xmlns:wp14="http://schemas.microsoft.com/office/word/2010/wordprocessingDrawing" xmlns:wp="http://schemas.openxmlformats.org/drawingml/2006/wordprocessingDrawing" xmlns:w10="urn:schemas-microsoft-com:office:word" xmlns:w="http://schemas.openxmlformats.org/wordprocessingml/2006/main" xmlns:w14="http://schemas.microsoft.com/office/word/2010/wordml" xmlns:w15="http://schemas.microsoft.com/office/word/2012/wordml" xmlns:w16cei="http://schemas.microsoft.com/office/word/2026/wordml/cei" xmlns:w16cex="http://schemas.microsoft.com/office/word/2018/wordml/cex" xmlns:w16cid="http://schemas.microsoft.com/office/word/2016/wordml/cid" xmlns:w16="http://schemas.microsoft.com/office/word/2018/wordml" xmlns:w16du="http://schemas.microsoft.com/office/word/2023/wordml/word16du" xmlns:w16sdtdh="http://schemas.microsoft.com/office/word/2020/wordml/sdtdatahash" xmlns:w16sdtfl="http://schemas.microsoft.com/office/word/2024/wordml/sdtformatlock" xmlns:w16se="http://schemas.microsoft.com/office/word/2015/wordml/symex" xmlns:wpg="http://schemas.microsoft.com/office/word/2010/wordprocessingGroup" xmlns:wpi="http://schemas.microsoft.com/office/word/2010/wordprocessingInk" xmlns:wne="http://schemas.microsoft.com/office/word/2006/wordml" xmlns:wps="http://schemas.microsoft.com/office/word/2010/wordprocessingShape" mc:Ignorable="w14 w15 w16se w16cid w16 w16cex w16sdtdh w16sdtfl w16du wp14">
   <w:body>
     <w:p>
       <w:pPr>
@@ -162,7 +162,39 @@
           <w:sz w:val="15"/>
           <w:szCs w:val="15"/>
         </w:rPr>
-        <w:t>I/We are fully informed through this Data Privacy Statement and Consent of Easycash’s guidelines regarding the processing of my/our personal data, which Easycash received by means of my/our loan, credit, or financial accommodation application submitted through Easycash’s office, website, or mobile application. I/We understand that all information that I/We declared and indicated for the purpose of obtaining loan, credit or any other financial accommodation may be used for verification, credit and risk management, credit scoring, know your customer checks, prevention and detection of fraud or crime, data analytics, automated and or manual processing of the loan, credit or financial accommodation application/s, data profiling, account review, upselling and cross-selling, direct marketing, complaints management, insurance, audit and administrative purposes, relationship management, system or product development and planning among other purposes and will be strictly kept confidential.</w:t>
+        <w:t xml:space="preserve">I/We are fully informed through this Data Privacy Statement and Consent of </w:t>
+      </w:r>
+      <w:proofErr w:type="spellStart"/>
+      <w:r>
+        <w:rPr>
+          <w:sz w:val="15"/>
+          <w:szCs w:val="15"/>
+        </w:rPr>
+        <w:t>Easycash’s</w:t>
+      </w:r>
+      <w:proofErr w:type="spellEnd"/>
+      <w:r>
+        <w:rPr>
+          <w:sz w:val="15"/>
+          <w:szCs w:val="15"/>
+        </w:rPr>
+        <w:t xml:space="preserve"> guidelines regarding the processing of my/our personal data, which Easycash received by means of my/our loan, credit, or financial accommodation application submitted through </w:t>
+      </w:r>
+      <w:proofErr w:type="spellStart"/>
+      <w:r>
+        <w:rPr>
+          <w:sz w:val="15"/>
+          <w:szCs w:val="15"/>
+        </w:rPr>
+        <w:t>Easycash’s</w:t>
+      </w:r>
+      <w:proofErr w:type="spellEnd"/>
+      <w:r>
+        <w:rPr>
+          <w:sz w:val="15"/>
+          <w:szCs w:val="15"/>
+        </w:rPr>
+        <w:t xml:space="preserve"> office, website, or mobile application. I/We understand that all information that I/We declared and indicated for the purpose of obtaining loan, credit or any other financial accommodation may be used for verification, credit and risk management, credit scoring, know your customer checks, prevention and detection of fraud or crime, data analytics, automated and or manual processing of the loan, credit or financial accommodation application/s, data profiling, account review, upselling and cross-selling, direct marketing, complaints management, insurance, audit and administrative purposes, relationship management, system or product development and planning among other purposes and will be strictly kept confidential.</w:t>
       </w:r>
     </w:p>
     <w:p>
@@ -234,142 +266,254 @@
           <w:sz w:val="15"/>
           <w:szCs w:val="15"/>
         </w:rPr>
-        <w:t>2. I/We understand that Easycash works with partners, credit bureau entities, and third-party service providers to effectively serve its clients, including me/us. I/We are informed that Easycash’s partners, credit bureau entities,s and third-party service providers may include my/our employer, whether private or government (for payroll deduction or any other auto-deduction procedures), relevant government agencies, credit bureaus, banks and financial institutions, collection agencies, and other entities.</w:t>
-      </w:r>
-    </w:p>
-    <w:p>
-      <w:pPr>
-        <w:spacing w:line="240" w:lineRule="auto"/>
-        <w:jc w:val="both"/>
-        <w:rPr>
-          <w:sz w:val="15"/>
-          <w:szCs w:val="15"/>
-        </w:rPr>
-      </w:pPr>
-    </w:p>
-    <w:p>
-      <w:pPr>
-        <w:spacing w:line="240" w:lineRule="auto"/>
-        <w:jc w:val="both"/>
-        <w:rPr>
-          <w:sz w:val="15"/>
-          <w:szCs w:val="15"/>
-        </w:rPr>
-      </w:pPr>
-      <w:r>
-        <w:rPr>
-          <w:sz w:val="15"/>
-          <w:szCs w:val="15"/>
-        </w:rPr>
-        <w:t>3. I/We authorize Easycash, directly or through its partners, credit bureau entities and third party service providers, to collect, process, use, store, disclose and share my/our personal data including but not limited to my/our name/s, age/s, birthdate/s, birthplace/s or ethnic origin/s, religion, civil status/es, spouse’s details, educational background/s, family background/s, preferences, behaviour, photographs, fingerprints, other biometric data (facial recognition and voice recognition), employment and or business details, income, financial data, and other information that I/We indicated in the application form. I/We allow the use of these information for verification, credit and risk management, credit scoring, know your customer checks, prevention and detection of fraud or crime, data analytics, automated and or manual processing of the loan, credit or financial accommodation application/s, data profiling, account review, upselling and cross-selling, direct marketing, complaints management, insurance, audit and administrative purposes, relationship management, system or product development and planning among other purposes as well as collecting and establishing applicable interest and amount.</w:t>
-      </w:r>
-    </w:p>
-    <w:p>
-      <w:pPr>
-        <w:spacing w:line="240" w:lineRule="auto"/>
-        <w:jc w:val="both"/>
-        <w:rPr>
-          <w:sz w:val="15"/>
-          <w:szCs w:val="15"/>
-        </w:rPr>
-      </w:pPr>
-    </w:p>
-    <w:p>
-      <w:pPr>
-        <w:spacing w:line="240" w:lineRule="auto"/>
-        <w:jc w:val="both"/>
-        <w:rPr>
-          <w:sz w:val="15"/>
-          <w:szCs w:val="15"/>
-        </w:rPr>
-      </w:pPr>
-      <w:r>
-        <w:rPr>
-          <w:sz w:val="15"/>
-          <w:szCs w:val="15"/>
-        </w:rPr>
-        <w:t>4. I/We allow Easycash to share my/our personal data with Easycash‘s subsidiaries, partners, credit bureau entities, and third-party service providers. I/We understand that these personal data will be utilized for verification, credit and risk management, credit scoring, know your customer checks, prevention and detection of fraud or crime, data analytics, automated and or manual processing of the loan, credit or financial accommodation application/s, data profiling, account review, upselling and cross-selling, direct marketing, complaints management, insurance, audit and administrative purposes, relationship management, system or product development and planning among other purposes as well as collecting and establishing applicable interest and amount.</w:t>
-      </w:r>
-    </w:p>
-    <w:p>
-      <w:pPr>
-        <w:spacing w:line="240" w:lineRule="auto"/>
-        <w:jc w:val="both"/>
-        <w:rPr>
-          <w:sz w:val="15"/>
-          <w:szCs w:val="15"/>
-        </w:rPr>
-      </w:pPr>
-    </w:p>
-    <w:p>
-      <w:pPr>
-        <w:spacing w:line="240" w:lineRule="auto"/>
-        <w:jc w:val="both"/>
-        <w:rPr>
-          <w:sz w:val="15"/>
-          <w:szCs w:val="15"/>
-        </w:rPr>
-      </w:pPr>
-      <w:r>
-        <w:rPr>
-          <w:sz w:val="15"/>
-          <w:szCs w:val="15"/>
-        </w:rPr>
-        <w:t>5. I/We authorize Easycash’s subsidiaries, partners, credit bureau entities and third party service providers to share with Easycash, its affiliates or subsidiaries, my/our personal data for authentication and verification, credit and risk management, credit scoring, know your customer checks, prevention and detection of fraud or crime, data analytics, automated and or manual processing of the loan, credit or financial accommodation application/s, data profiling, review, upselling and cross-selling, direct marketing, complaints management, insurance, audit and administrative purposes, relationship management, system or product development and planning among other purposes as well as collecting and establishing applicable interest and amount.</w:t>
-      </w:r>
-    </w:p>
-    <w:p>
-      <w:pPr>
-        <w:spacing w:line="240" w:lineRule="auto"/>
-        <w:jc w:val="both"/>
-        <w:rPr>
-          <w:sz w:val="15"/>
-          <w:szCs w:val="15"/>
-        </w:rPr>
-      </w:pPr>
-    </w:p>
-    <w:p>
-      <w:pPr>
-        <w:spacing w:line="240" w:lineRule="auto"/>
-        <w:jc w:val="both"/>
-        <w:rPr>
-          <w:sz w:val="15"/>
-          <w:szCs w:val="15"/>
-        </w:rPr>
-      </w:pPr>
-      <w:r>
-        <w:rPr>
-          <w:sz w:val="15"/>
-          <w:szCs w:val="15"/>
-        </w:rPr>
-        <w:t>6. I/We give consent to Easycash and its subsidiaries, partners, credit bureau entities and third party service providers for them to contact me/us by means of personal visit, phone call and or send me/us messages, notices, announcements through pre-recorded voice and or video messages, fax, MMS/SMS, email, postal mail, or any other means of communication for: (a) updating me/us about the status of my/our loan, credit and or financial accommodation application and or account; (b) collection purpose; (c) marketing and or cross selling or upselling of Easycash’s other products and services; and (d) for any other legal purpose. I/We also authorize Easycash and affiliates, subsidiaries, partners, credit bureau entities, and third-party service providers to record the telephone conversations or any conversation with its employees, representatives, or agents. Furthermore, I/We agree to hold Easycash not liable to any loss, injury, or damage that I/We may suffer in relation to any means of communication specified above from Easycash.</w:t>
-      </w:r>
-    </w:p>
-    <w:p>
-      <w:pPr>
-        <w:spacing w:line="240" w:lineRule="auto"/>
-        <w:jc w:val="both"/>
-        <w:rPr>
-          <w:sz w:val="15"/>
-          <w:szCs w:val="15"/>
-        </w:rPr>
-      </w:pPr>
-    </w:p>
-    <w:p>
-      <w:pPr>
-        <w:spacing w:line="240" w:lineRule="auto"/>
-        <w:jc w:val="both"/>
-        <w:rPr>
-          <w:sz w:val="15"/>
-          <w:szCs w:val="15"/>
-        </w:rPr>
-      </w:pPr>
-      <w:r>
-        <w:rPr>
-          <w:sz w:val="15"/>
-          <w:szCs w:val="15"/>
-        </w:rPr>
-        <w:t>7. I/We authorize Easycash to maintain copy/ies of my/our personal data, pertinent information, and other documents for up to five (5) years for Easycash to perform its sanctioned objectives and purposes effectively, legal claims, or any other purpose as provided by law. I/We are also informed that all of my/our personal data may continue to be collected, stored, processed and or shared for up to five (5) years from the conclusion of my/our transactions with Easycash, its subsidiaries, partners, credit bureau entities and third party service providers or until the expiration of the retention limits set by applicable laws, whichever comes later.</w:t>
+        <w:t xml:space="preserve">2. I/We understand that Easycash works with partners, credit bureau entities, and third-party service providers to effectively serve its clients, including me/us. I/We are informed that </w:t>
+      </w:r>
+      <w:proofErr w:type="spellStart"/>
+      <w:r>
+        <w:rPr>
+          <w:sz w:val="15"/>
+          <w:szCs w:val="15"/>
+        </w:rPr>
+        <w:t>Easycash’s</w:t>
+      </w:r>
+      <w:proofErr w:type="spellEnd"/>
+      <w:r>
+        <w:rPr>
+          <w:sz w:val="15"/>
+          <w:szCs w:val="15"/>
+        </w:rPr>
+        <w:t xml:space="preserve"> partners, credit bureau </w:t>
+      </w:r>
+      <w:proofErr w:type="spellStart"/>
+      <w:r>
+        <w:rPr>
+          <w:sz w:val="15"/>
+          <w:szCs w:val="15"/>
+        </w:rPr>
+        <w:t>entities,s</w:t>
+      </w:r>
+      <w:proofErr w:type="spellEnd"/>
+      <w:r>
+        <w:rPr>
+          <w:sz w:val="15"/>
+          <w:szCs w:val="15"/>
+        </w:rPr>
+        <w:t xml:space="preserve"> and third-party service providers may include my/our employer, whether private or government (for payroll deduction or any other auto-deduction procedures), relevant government agencies, credit bureaus, banks and financial institutions, collection agencies, and other entities.</w:t>
+      </w:r>
+    </w:p>
+    <w:p>
+      <w:pPr>
+        <w:spacing w:line="240" w:lineRule="auto"/>
+        <w:jc w:val="both"/>
+        <w:rPr>
+          <w:sz w:val="15"/>
+          <w:szCs w:val="15"/>
+        </w:rPr>
+      </w:pPr>
+    </w:p>
+    <w:p>
+      <w:pPr>
+        <w:spacing w:line="240" w:lineRule="auto"/>
+        <w:jc w:val="both"/>
+        <w:rPr>
+          <w:sz w:val="15"/>
+          <w:szCs w:val="15"/>
+        </w:rPr>
+      </w:pPr>
+      <w:r>
+        <w:rPr>
+          <w:sz w:val="15"/>
+          <w:szCs w:val="15"/>
+        </w:rPr>
+        <w:t xml:space="preserve">3. I/We authorize Easycash, directly or through its partners, credit bureau entities and third party service providers, to collect, process, use, store, disclose and share my/our personal data including but not limited to my/our name/s, age/s, birthdate/s, birthplace/s or ethnic origin/s, religion, civil status/es, spouse’s details, educational background/s, family background/s, preferences, </w:t>
+      </w:r>
+      <w:proofErr w:type="spellStart"/>
+      <w:r>
+        <w:rPr>
+          <w:sz w:val="15"/>
+          <w:szCs w:val="15"/>
+        </w:rPr>
+        <w:t>behaviour</w:t>
+      </w:r>
+      <w:proofErr w:type="spellEnd"/>
+      <w:r>
+        <w:rPr>
+          <w:sz w:val="15"/>
+          <w:szCs w:val="15"/>
+        </w:rPr>
+        <w:t>, photographs, fingerprints, other biometric data (facial recognition and voice recognition), employment and or business details, income, financial data, and other information that I/We indicated in the application form. I/We allow the use of these information for verification, credit and risk management, credit scoring, know your customer checks, prevention and detection of fraud or crime, data analytics, automated and or manual processing of the loan, credit or financial accommodation application/s, data profiling, account review, upselling and cross-selling, direct marketing, complaints management, insurance, audit and administrative purposes, relationship management, system or product development and planning among other purposes as well as collecting and establishing applicable interest and amount.</w:t>
+      </w:r>
+    </w:p>
+    <w:p>
+      <w:pPr>
+        <w:spacing w:line="240" w:lineRule="auto"/>
+        <w:jc w:val="both"/>
+        <w:rPr>
+          <w:sz w:val="15"/>
+          <w:szCs w:val="15"/>
+        </w:rPr>
+      </w:pPr>
+    </w:p>
+    <w:p>
+      <w:pPr>
+        <w:spacing w:line="240" w:lineRule="auto"/>
+        <w:jc w:val="both"/>
+        <w:rPr>
+          <w:sz w:val="15"/>
+          <w:szCs w:val="15"/>
+        </w:rPr>
+      </w:pPr>
+      <w:r>
+        <w:rPr>
+          <w:sz w:val="15"/>
+          <w:szCs w:val="15"/>
+        </w:rPr>
+        <w:t xml:space="preserve">4. I/We allow Easycash to share my/our personal data with </w:t>
+      </w:r>
+      <w:proofErr w:type="spellStart"/>
+      <w:r>
+        <w:rPr>
+          <w:sz w:val="15"/>
+          <w:szCs w:val="15"/>
+        </w:rPr>
+        <w:t>Easycash‘s</w:t>
+      </w:r>
+      <w:proofErr w:type="spellEnd"/>
+      <w:r>
+        <w:rPr>
+          <w:sz w:val="15"/>
+          <w:szCs w:val="15"/>
+        </w:rPr>
+        <w:t xml:space="preserve"> subsidiaries, partners, credit bureau entities, and third-party service providers. I/We understand that these personal data will be utilized for verification, credit and risk management, credit scoring, know your customer checks, prevention and detection of fraud or crime, data analytics, automated and or manual processing of the loan, credit or financial accommodation application/s, data profiling, account review, upselling and cross-selling, direct marketing, complaints management, insurance, audit and administrative purposes, relationship management, system or product development and planning among other purposes as well as collecting and establishing applicable interest and amount.</w:t>
+      </w:r>
+    </w:p>
+    <w:p>
+      <w:pPr>
+        <w:spacing w:line="240" w:lineRule="auto"/>
+        <w:jc w:val="both"/>
+        <w:rPr>
+          <w:sz w:val="15"/>
+          <w:szCs w:val="15"/>
+        </w:rPr>
+      </w:pPr>
+    </w:p>
+    <w:p>
+      <w:pPr>
+        <w:spacing w:line="240" w:lineRule="auto"/>
+        <w:jc w:val="both"/>
+        <w:rPr>
+          <w:sz w:val="15"/>
+          <w:szCs w:val="15"/>
+        </w:rPr>
+      </w:pPr>
+      <w:r>
+        <w:rPr>
+          <w:sz w:val="15"/>
+          <w:szCs w:val="15"/>
+        </w:rPr>
+        <w:t xml:space="preserve">5. I/We authorize </w:t>
+      </w:r>
+      <w:proofErr w:type="spellStart"/>
+      <w:r>
+        <w:rPr>
+          <w:sz w:val="15"/>
+          <w:szCs w:val="15"/>
+        </w:rPr>
+        <w:t>Easycash’s</w:t>
+      </w:r>
+      <w:proofErr w:type="spellEnd"/>
+      <w:r>
+        <w:rPr>
+          <w:sz w:val="15"/>
+          <w:szCs w:val="15"/>
+        </w:rPr>
+        <w:t xml:space="preserve"> subsidiaries, partners, credit bureau entities and third party service providers to share with Easycash, its affiliates or subsidiaries, my/our personal data for authentication and verification, credit and risk management, credit scoring, know your customer checks, prevention and detection of fraud or crime, data analytics, automated and or manual processing of the loan, credit or financial accommodation application/s, data profiling, review, upselling and cross-selling, direct marketing, complaints management, insurance, audit and administrative purposes, relationship management, system or product development and planning among other purposes as well as collecting and establishing applicable interest and amount.</w:t>
+      </w:r>
+    </w:p>
+    <w:p>
+      <w:pPr>
+        <w:spacing w:line="240" w:lineRule="auto"/>
+        <w:jc w:val="both"/>
+        <w:rPr>
+          <w:sz w:val="15"/>
+          <w:szCs w:val="15"/>
+        </w:rPr>
+      </w:pPr>
+    </w:p>
+    <w:p>
+      <w:pPr>
+        <w:spacing w:line="240" w:lineRule="auto"/>
+        <w:jc w:val="both"/>
+        <w:rPr>
+          <w:sz w:val="15"/>
+          <w:szCs w:val="15"/>
+        </w:rPr>
+      </w:pPr>
+      <w:r>
+        <w:rPr>
+          <w:sz w:val="15"/>
+          <w:szCs w:val="15"/>
+        </w:rPr>
+        <w:t xml:space="preserve">6. I/We give consent to Easycash and its subsidiaries, partners, credit bureau entities and third party service providers for them to contact me/us by means of personal visit, phone call and or send me/us messages, notices, announcements through pre-recorded voice and or video messages, fax, MMS/SMS, email, postal mail, or any other means of communication for: (a) updating me/us about the status of my/our loan, credit and or financial accommodation application and or account; (b) collection purpose; (c) marketing and or cross selling or upselling of </w:t>
+      </w:r>
+      <w:proofErr w:type="spellStart"/>
+      <w:r>
+        <w:rPr>
+          <w:sz w:val="15"/>
+          <w:szCs w:val="15"/>
+        </w:rPr>
+        <w:t>Easycash’s</w:t>
+      </w:r>
+      <w:proofErr w:type="spellEnd"/>
+      <w:r>
+        <w:rPr>
+          <w:sz w:val="15"/>
+          <w:szCs w:val="15"/>
+        </w:rPr>
+        <w:t xml:space="preserve"> other products and services; and (d) for any other legal purpose. I/We also authorize Easycash and affiliates, subsidiaries, partners, credit bureau entities, and third-party service providers to record the telephone conversations or any conversation with its employees, representatives, or agents. Furthermore, I/We agree to hold Easycash not liable to any loss, injury, or damage that I/We may suffer in relation to any means of communication specified above from Easycash.</w:t>
+      </w:r>
+    </w:p>
+    <w:p>
+      <w:pPr>
+        <w:spacing w:line="240" w:lineRule="auto"/>
+        <w:jc w:val="both"/>
+        <w:rPr>
+          <w:sz w:val="15"/>
+          <w:szCs w:val="15"/>
+        </w:rPr>
+      </w:pPr>
+    </w:p>
+    <w:p>
+      <w:pPr>
+        <w:spacing w:line="240" w:lineRule="auto"/>
+        <w:jc w:val="both"/>
+        <w:rPr>
+          <w:sz w:val="15"/>
+          <w:szCs w:val="15"/>
+        </w:rPr>
+      </w:pPr>
+      <w:r>
+        <w:rPr>
+          <w:sz w:val="15"/>
+          <w:szCs w:val="15"/>
+        </w:rPr>
+        <w:t>7. I/We authorize Easycash to maintain copy/</w:t>
+      </w:r>
+      <w:proofErr w:type="spellStart"/>
+      <w:r>
+        <w:rPr>
+          <w:sz w:val="15"/>
+          <w:szCs w:val="15"/>
+        </w:rPr>
+        <w:t>ies</w:t>
+      </w:r>
+      <w:proofErr w:type="spellEnd"/>
+      <w:r>
+        <w:rPr>
+          <w:sz w:val="15"/>
+          <w:szCs w:val="15"/>
+        </w:rPr>
+        <w:t xml:space="preserve"> of my/our personal data, pertinent information, and other documents for up to five (5) years for Easycash to perform its sanctioned objectives and purposes effectively, legal claims, or any other purpose as provided by law. I/We are also informed that all of my/our personal data may continue to be collected, stored, processed and or shared for up to five (5) years from the conclusion of my/our transactions with Easycash, its subsidiaries, partners, credit bureau entities and third party service providers or until the expiration of the retention limits set by applicable laws, whichever comes later.</w:t>
       </w:r>
     </w:p>
     <w:p>
@@ -477,7 +621,23 @@
           <w:sz w:val="15"/>
           <w:szCs w:val="15"/>
         </w:rPr>
-        <w:t>11. This is to inform that the consent I/We provided is subject to data privacy laws, rules, and regulations. I/We moreover understand that I/We can contact Easycash to request for information, access to, and correction of my/your personal data and I/We know of my/our right to decline any further processing, except as may be required to continue my/our existing loan, credit or financial accommodation application and or account with Easycash by sending a mail addressed to the Data Protection and Compliance Officer through Easycash’s postal address of Unit 9 Ground Floor The Midland Plaza M Adriatico Barangay 669 Ermita Manila.</w:t>
+        <w:t xml:space="preserve">11. This is to inform that the consent I/We provided is subject to data privacy laws, rules, and regulations. I/We moreover understand that I/We can contact Easycash to request for information, access to, and correction of my/your personal data and I/We know of my/our right to decline any further processing, except as may be required to continue my/our existing loan, credit or financial accommodation application and or account with Easycash by sending a mail addressed to the Data Protection and Compliance Officer through </w:t>
+      </w:r>
+      <w:proofErr w:type="spellStart"/>
+      <w:r>
+        <w:rPr>
+          <w:sz w:val="15"/>
+          <w:szCs w:val="15"/>
+        </w:rPr>
+        <w:t>Easycash’s</w:t>
+      </w:r>
+      <w:proofErr w:type="spellEnd"/>
+      <w:r>
+        <w:rPr>
+          <w:sz w:val="15"/>
+          <w:szCs w:val="15"/>
+        </w:rPr>
+        <w:t xml:space="preserve"> postal address of Unit 9 Ground Floor The Midland Plaza M Adriatico Barangay 669 Ermita Manila.</w:t>
       </w:r>
     </w:p>
     <w:p>
@@ -593,7 +753,7 @@
                 <w:sz w:val="2"/>
                 <w:szCs w:val="2"/>
               </w:rPr>
-              <w:t xml:space="preserve">[[SIGNATURE_ANCHOR]]</w:t>
+              <w:t>[[SIGNATURE_ANCHOR]]</w:t>
             </w:r>
           </w:p>
           <w:p>
@@ -615,23 +775,29 @@
                 <w:szCs w:val="16"/>
                 <w:u w:val="single"/>
               </w:rPr>
-              <w:t>{BorrowerName}</w:t>
+              <w:t>{</w:t>
             </w:r>
-          </w:p>
-          <w:p>
-            <w:pPr>
-              <w:jc w:val="center"/>
+            <w:proofErr w:type="spellStart"/>
+            <w:r>
               <w:rPr>
+                <w:b/>
+                <w:bCs/>
                 <w:sz w:val="16"/>
                 <w:szCs w:val="16"/>
+                <w:u w:val="single"/>
               </w:rPr>
-            </w:pPr>
+              <w:t>BorrowerName</w:t>
+            </w:r>
+            <w:proofErr w:type="spellEnd"/>
             <w:r>
               <w:rPr>
+                <w:b/>
+                <w:bCs/>
                 <w:sz w:val="16"/>
                 <w:szCs w:val="16"/>
+                <w:u w:val="single"/>
               </w:rPr>
-              <w:t>BORROWER SIGNATURE OVER PRINTED NAME</w:t>
+              <w:t>}</w:t>
             </w:r>
           </w:p>
           <w:p>
@@ -704,23 +870,29 @@
                 <w:szCs w:val="16"/>
                 <w:u w:val="single"/>
               </w:rPr>
-              <w:t>{CoBorrowerName}</w:t>
+              <w:t>{</w:t>
             </w:r>
-          </w:p>
-          <w:p>
-            <w:pPr>
-              <w:jc w:val="center"/>
+            <w:proofErr w:type="spellStart"/>
+            <w:r>
               <w:rPr>
+                <w:b/>
+                <w:bCs/>
                 <w:sz w:val="16"/>
                 <w:szCs w:val="16"/>
+                <w:u w:val="single"/>
               </w:rPr>
-            </w:pPr>
+              <w:t>CoBorrowerName</w:t>
+            </w:r>
+            <w:proofErr w:type="spellEnd"/>
             <w:r>
               <w:rPr>
+                <w:b/>
+                <w:bCs/>
                 <w:sz w:val="16"/>
                 <w:szCs w:val="16"/>
+                <w:u w:val="single"/>
               </w:rPr>
-              <w:t>CO-BORROWER SIGNATURE OVER PRINTED NAME</w:t>
+              <w:t>}</w:t>
             </w:r>
           </w:p>
           <w:p>
@@ -1271,6 +1443,7 @@
   <w:style w:type="character" w:default="1" w:styleId="DefaultParagraphFont">
     <w:name w:val="Default Paragraph Font"/>
     <w:uiPriority w:val="1"/>
+    <w:semiHidden/>
     <w:unhideWhenUsed/>
   </w:style>
   <w:style w:type="table" w:default="1" w:styleId="TableNormal">

</xml_diff>